<commit_message>
Corregir campos XML (TOC y numero de pagina) para que Word abra el documento
</commit_message>
<xml_diff>
--- a/Ruta-Institucional-Emprendimiento-CIE.docx
+++ b/Ruta-Institucional-Emprendimiento-CIE.docx
@@ -166,9 +166,10 @@
       </w:r>
     </w:p>
     <w:p>
-      <w:r/>
       <w:fldSimple w:instr="TOC \o &quot;1-3&quot; \h \z \u">
-        <w:t>Tabla de contenido — actualizar en Word: clic derecho &gt; Actualizar campos.</w:t>
+        <w:r>
+          <w:t>Actualizar la tabla de contenido en Word: clic derecho &gt; Actualizar campos.</w:t>
+        </w:r>
       </w:fldSimple>
     </w:p>
     <w:p>
@@ -3090,7 +3091,11 @@
       </w:rPr>
       <w:t xml:space="preserve">Ruta Institucional de Emprendimiento — CIE · Página </w:t>
     </w:r>
-    <w:fldSimple w:instr="PAGE"/>
+    <w:fldSimple w:instr="PAGE">
+      <w:r>
+        <w:t>1</w:t>
+      </w:r>
+    </w:fldSimple>
   </w:p>
 </w:ftr>
 </file>

</xml_diff>

<commit_message>
Fase 1 de la ruta: elimina hackathones y retos; deja las 4 actividades definidas
</commit_message>
<xml_diff>
--- a/Ruta-Institucional-Emprendimiento-CIE.docx
+++ b/Ruta-Institucional-Emprendimiento-CIE.docx
@@ -1445,20 +1445,6 @@
           <w:b w:val="0"/>
         </w:rPr>
         <w:t>Ferias de emprendimiento y muestras de proyectos de la comunidad.</w:t>
-      </w:r>
-    </w:p>
-    <w:p>
-      <w:pPr>
-        <w:pStyle w:val="ListBullet"/>
-        <w:spacing w:after="60"/>
-        <w:ind w:left="454"/>
-        <w:jc w:val="both"/>
-      </w:pPr>
-      <w:r>
-        <w:rPr>
-          <w:b w:val="0"/>
-        </w:rPr>
-        <w:t>Hackathones y retos de innovación interdisciplinarios.</w:t>
       </w:r>
     </w:p>
     <w:p>

</xml_diff>

<commit_message>
Ruta (Word y PPT): 3 componentes transversales, red de mentores y actividades conjuntas (alineado al informe)
</commit_message>
<xml_diff>
--- a/Ruta-Institucional-Emprendimiento-CIE.docx
+++ b/Ruta-Institucional-Emprendimiento-CIE.docx
@@ -1148,7 +1148,7 @@
               <w:rPr>
                 <w:b/>
               </w:rPr>
-              <w:t>Pool de mentores multidisciplinarios</w:t>
+              <w:t>Red de mentores multidisciplinarios</w:t>
             </w:r>
           </w:p>
         </w:tc>
@@ -1259,7 +1259,7 @@
           <w:b w:val="0"/>
           <w:i w:val="0"/>
         </w:rPr>
-        <w:t>La ruta se compone de seis fases secuenciales, organizadas por nivel de madurez del proyecto, y de dos componentes transversales que acompañan todas las fases. Su carácter no lineal permite que cada iniciativa ingrese en la fase correspondiente a su estado, tras el diagnóstico de la Fase 3.</w:t>
+        <w:t>La ruta se compone de seis fases secuenciales, organizadas por nivel de madurez del proyecto, y de tres componentes transversales que acompañan todas las fases: T1. comunicación; T2. seguimiento e indicadores; y T3. articulación con las facultades. Su carácter no lineal permite que cada iniciativa ingrese en la fase correspondiente a su estado, tras el diagnóstico de la Fase 3.</w:t>
       </w:r>
     </w:p>
     <w:p>
@@ -1269,7 +1269,7 @@
       <w:r>
         <w:drawing>
           <wp:inline xmlns:a="http://schemas.openxmlformats.org/drawingml/2006/main" xmlns:pic="http://schemas.openxmlformats.org/drawingml/2006/picture">
-            <wp:extent cx="5760720" cy="2785750"/>
+            <wp:extent cx="5760720" cy="3220256"/>
             <wp:docPr id="1" name="Picture 1"/>
             <wp:cNvGraphicFramePr>
               <a:graphicFrameLocks noChangeAspect="1"/>
@@ -1290,7 +1290,7 @@
                   <pic:spPr>
                     <a:xfrm>
                       <a:off x="0" y="0"/>
-                      <a:ext cx="5760720" cy="2785750"/>
+                      <a:ext cx="5760720" cy="3220256"/>
                     </a:xfrm>
                     <a:prstGeom prst="rect"/>
                   </pic:spPr>
@@ -1328,7 +1328,7 @@
         <w:pStyle w:val="Heading2"/>
       </w:pPr>
       <w:r>
-        <w:t>9.1 T1. Difusión y comunicación</w:t>
+        <w:t>9.1 T1. Comunicación</w:t>
       </w:r>
     </w:p>
     <w:p>
@@ -1349,7 +1349,7 @@
         <w:pStyle w:val="Heading2"/>
       </w:pPr>
       <w:r>
-        <w:t>9.2 T2. Seguimiento, indicadores y articulación</w:t>
+        <w:t>9.2 T2. Seguimiento e indicadores</w:t>
       </w:r>
     </w:p>
     <w:p>
@@ -1362,7 +1362,28 @@
           <w:b w:val="0"/>
           <w:i w:val="0"/>
         </w:rPr>
-        <w:t>Componente que registra el avance de cada proyecto a lo largo de la ruta, mide el impacto mediante indicadores y coordina la articulación permanente con las facultades a través de los docentes enlace. Garantiza la continuidad de los procesos —una de las debilidades identificadas— y alimenta la meta de sostenibilidad del PDI (≥ 3 %).</w:t>
+        <w:t>Componente que registra el avance de cada proyecto a lo largo de la ruta y mide el impacto mediante indicadores de gestión y resultado. Garantiza la continuidad de los procesos —una de las debilidades identificadas— y alimenta la meta de sostenibilidad del PDI (≥ 3 %).</w:t>
+      </w:r>
+    </w:p>
+    <w:p>
+      <w:pPr>
+        <w:pStyle w:val="Heading2"/>
+      </w:pPr>
+      <w:r>
+        <w:t>9.3 T3. Articulación con las facultades</w:t>
+      </w:r>
+    </w:p>
+    <w:p>
+      <w:pPr>
+        <w:spacing w:after="120"/>
+        <w:jc w:val="both"/>
+      </w:pPr>
+      <w:r>
+        <w:rPr>
+          <w:b w:val="0"/>
+          <w:i w:val="0"/>
+        </w:rPr>
+        <w:t>Componente que coordina la relación permanente entre el CIE y las facultades a través de los docentes enlace. Asegura que la oferta y el acompañamiento de la ruta lleguen de forma transversal a toda la comunidad universitaria y que los proyectos surgidos en cada facultad se canalicen hacia la ruta.</w:t>
       </w:r>
     </w:p>
     <w:p>
@@ -2030,7 +2051,7 @@
         <w:t xml:space="preserve">Responsables: </w:t>
       </w:r>
       <w:r>
-        <w:t>CIE, pool de mentores y docentes enlace (integración curricular).</w:t>
+        <w:t>CIE, red de mentores y docentes enlace (integración curricular).</w:t>
       </w:r>
     </w:p>
     <w:p>
@@ -2216,7 +2237,7 @@
         <w:t xml:space="preserve">Responsables: </w:t>
       </w:r>
       <w:r>
-        <w:t>Pool de mentores multidisciplinarios y aliados.</w:t>
+        <w:t>Red de mentores multidisciplinarios y aliados.</w:t>
       </w:r>
     </w:p>
     <w:p>
@@ -2536,13 +2557,13 @@
         <w:rPr>
           <w:b/>
         </w:rPr>
-        <w:t>Retos interdisciplinarios:</w:t>
+        <w:t>Actividades y eventos conjuntos por facultad:</w:t>
       </w:r>
       <w:r>
         <w:rPr>
           <w:b w:val="0"/>
         </w:rPr>
-        <w:t xml:space="preserve"> convocatorias que reúnan a estudiantes de distintas facultades alrededor de problemas reales.</w:t>
+        <w:t xml:space="preserve"> ferias, muestras y encuentros organizados con cada facultad para acercar el emprendimiento a los estudiantes en su contexto disciplinar.</w:t>
       </w:r>
     </w:p>
     <w:p>

</xml_diff>

<commit_message>
Ruta (Word): agrega justificacion fluida del diseno por fase (proposito, anclaje PDI y evidencia)
</commit_message>
<xml_diff>
--- a/Ruta-Institucional-Emprendimiento-CIE.docx
+++ b/Ruta-Institucional-Emprendimiento-CIE.docx
@@ -1434,6 +1434,21 @@
     </w:p>
     <w:p>
       <w:pPr>
+        <w:jc w:val="both"/>
+      </w:pPr>
+      <w:r>
+        <w:rPr>
+          <w:b/>
+          <w:color w:val="E47331"/>
+        </w:rPr>
+        <w:t xml:space="preserve">Justificación del diseño. </w:t>
+      </w:r>
+      <w:r>
+        <w:t>Esta fase constituye la puerta de entrada a la ruta. Dado que el principal problema identificado es que la comunidad desconoce el CIE pese a su alto interés emprendedor (87,7 %), la ruta debe comenzar por despertar la cultura emprendedora y dar a conocer la oferta del Centro; por ello es de carácter masivo y transversal a todas las facultades. Su diseño responde a la Estrategia 7 del PDI —«sensibilización»— y a la Acción 1 del Proyecto de Fortalecimiento del Ecosistema (programas de fomento a la cultura), y se sustenta en la demanda de charlas y talleres expresada en las encuestas, así como en el benchmarking de referentes como la Corporación Universitaria Americana, la Universidad de los Andes y EAFIT, que confirman que toda ruta madura inicia por la sensibilización.</w:t>
+      </w:r>
+    </w:p>
+    <w:p>
+      <w:pPr>
         <w:pStyle w:val="Heading3"/>
       </w:pPr>
       <w:r>
@@ -1550,21 +1565,6 @@
       </w:r>
       <w:r>
         <w:t>Transversal / continuo.</w:t>
-      </w:r>
-    </w:p>
-    <w:p>
-      <w:pPr>
-        <w:jc w:val="both"/>
-      </w:pPr>
-      <w:r>
-        <w:rPr>
-          <w:b/>
-          <w:color w:val="E47331"/>
-        </w:rPr>
-        <w:t xml:space="preserve">Anclaje (PDI y evidencia): </w:t>
-      </w:r>
-      <w:r>
-        <w:t>PDI, Estrategia 7 (sensibilización). Encuesta a estudiantes: 45 % solicita talleres de creatividad e innovación.</w:t>
       </w:r>
     </w:p>
     <w:p>
@@ -1606,6 +1606,21 @@
     </w:p>
     <w:p>
       <w:pPr>
+        <w:jc w:val="both"/>
+      </w:pPr>
+      <w:r>
+        <w:rPr>
+          <w:b/>
+          <w:color w:val="E47331"/>
+        </w:rPr>
+        <w:t xml:space="preserve">Justificación del diseño. </w:t>
+      </w:r>
+      <w:r>
+        <w:t>Una vez despertado el interés, esta fase busca capturar las ideas antes de que se pierdan y ayudarlas a tomar forma, conectándose con los semilleros para nutrirse de proyectos de base científica. Su diseño se ancla en la Línea Estratégica 2.3 del PDI (fomentar el emprendimiento) y en la vinculación con la investigación propia del Motor Estratégico 2, y encuentra respaldo en los referentes maduros —como la Universidad de los Andes y la Corporación Universitaria Americana—, en los que la identificación de ideas aparece como el paso siguiente a la sensibilización.</w:t>
+      </w:r>
+    </w:p>
+    <w:p>
+      <w:pPr>
         <w:pStyle w:val="Heading3"/>
       </w:pPr>
       <w:r>
@@ -1722,21 +1737,6 @@
       </w:r>
       <w:r>
         <w:t>Semanas 1 a 2 del acompañamiento individual.</w:t>
-      </w:r>
-    </w:p>
-    <w:p>
-      <w:pPr>
-        <w:jc w:val="both"/>
-      </w:pPr>
-      <w:r>
-        <w:rPr>
-          <w:b/>
-          <w:color w:val="E47331"/>
-        </w:rPr>
-        <w:t xml:space="preserve">Anclaje (PDI y evidencia): </w:t>
-      </w:r>
-      <w:r>
-        <w:t>PDI, Estrategia 2. Complementa la sensibilización con captación efectiva.</w:t>
       </w:r>
     </w:p>
     <w:p>
@@ -1778,6 +1778,21 @@
     </w:p>
     <w:p>
       <w:pPr>
+        <w:jc w:val="both"/>
+      </w:pPr>
+      <w:r>
+        <w:rPr>
+          <w:b/>
+          <w:color w:val="E47331"/>
+        </w:rPr>
+        <w:t xml:space="preserve">Justificación del diseño. </w:t>
+      </w:r>
+      <w:r>
+        <w:t>Esta fase es el corazón que le da a la ruta su carácter no lineal y personalizado: mediante una herramienta de clasificación por nivel de madurez se define en qué fase ingresa cada proyecto y qué acompañamiento recibe. Su diseño ejecuta directamente la Acción 2 del Proyecto de Fortalecimiento del Ecosistema —«estandarizar las herramientas de asesoría y las metodologías de clasificación del CIE»— y se sustenta en el aporte de la tutora (la herramienta de clasificación), en la consulta interna al CIE y en referentes como MacondoLab y MAVI, que emplean el diagnóstico como punto de entrada.</w:t>
+      </w:r>
+    </w:p>
+    <w:p>
+      <w:pPr>
         <w:pStyle w:val="Heading3"/>
       </w:pPr>
       <w:r>
@@ -1894,21 +1909,6 @@
       </w:r>
       <w:r>
         <w:t>Semana 2 a 3.</w:t>
-      </w:r>
-    </w:p>
-    <w:p>
-      <w:pPr>
-        <w:jc w:val="both"/>
-      </w:pPr>
-      <w:r>
-        <w:rPr>
-          <w:b/>
-          <w:color w:val="E47331"/>
-        </w:rPr>
-        <w:t xml:space="preserve">Anclaje (PDI y evidencia): </w:t>
-      </w:r>
-      <w:r>
-        <w:t>Aporte de la tutora (herramienta de clasificación) y de los referentes; convergencia con la consulta interna.</w:t>
       </w:r>
     </w:p>
     <w:p>
@@ -1950,6 +1950,21 @@
     </w:p>
     <w:p>
       <w:pPr>
+        <w:jc w:val="both"/>
+      </w:pPr>
+      <w:r>
+        <w:rPr>
+          <w:b/>
+          <w:color w:val="E47331"/>
+        </w:rPr>
+        <w:t xml:space="preserve">Justificación del diseño. </w:t>
+      </w:r>
+      <w:r>
+        <w:t>Esta fase parte del principio de que el interés sin capacidades no prospera; por eso forma al emprendedor en modelo de negocio (Business Model Canvas), educación financiera y marketing, y valida la idea mediante un producto mínimo viable (MVP). Su diseño responde a la Estrategia 2 del PDI —«cultura de innovación y emprendimiento mediante programas de formación y asesoría»— y atiende exactamente lo que solicitaron los estudiantes en el diagnóstico: asesoría en modelo de negocio (62,3 %), educación financiera (50 %) y marketing (49,1 %).</w:t>
+      </w:r>
+    </w:p>
+    <w:p>
+      <w:pPr>
         <w:pStyle w:val="Heading3"/>
       </w:pPr>
       <w:r>
@@ -2080,21 +2095,6 @@
       </w:r>
       <w:r>
         <w:t>Semanas 3 a 8.</w:t>
-      </w:r>
-    </w:p>
-    <w:p>
-      <w:pPr>
-        <w:jc w:val="both"/>
-      </w:pPr>
-      <w:r>
-        <w:rPr>
-          <w:b/>
-          <w:color w:val="E47331"/>
-        </w:rPr>
-        <w:t xml:space="preserve">Anclaje (PDI y evidencia): </w:t>
-      </w:r>
-      <w:r>
-        <w:t>PDI, Estrategia 2 (formación y asesoría). Encuesta: asesoría de modelo de negocio 62 %, educación financiera 50 %, marketing 49 %.</w:t>
       </w:r>
     </w:p>
     <w:p>
@@ -2136,6 +2136,21 @@
     </w:p>
     <w:p>
       <w:pPr>
+        <w:jc w:val="both"/>
+      </w:pPr>
+      <w:r>
+        <w:rPr>
+          <w:b/>
+          <w:color w:val="E47331"/>
+        </w:rPr>
+        <w:t xml:space="preserve">Justificación del diseño. </w:t>
+      </w:r>
+      <w:r>
+        <w:t>Cuando el proyecto ya está validado, necesita robustecerse para operar de manera sostenible; por ello esta fase ofrece mentorías especializadas, branding, transformación digital y asesoría legal y tributaria. Su diseño se ancla en la Línea Estratégica 2.3 del PDI (impacto productivo) y en la Acción 4 del Proyecto de Fortalecimiento (alianzas estratégicas para el acompañamiento), y se sustenta en la ruta de la Corporación MAVI —que incorpora branding y transformación digital— y en la demanda docente y estudiantil de mentorías y acompañamiento legal.</w:t>
+      </w:r>
+    </w:p>
+    <w:p>
+      <w:pPr>
         <w:pStyle w:val="Heading3"/>
       </w:pPr>
       <w:r>
@@ -2266,21 +2281,6 @@
       </w:r>
       <w:r>
         <w:t>Semanas 8 a 14.</w:t>
-      </w:r>
-    </w:p>
-    <w:p>
-      <w:pPr>
-        <w:jc w:val="both"/>
-      </w:pPr>
-      <w:r>
-        <w:rPr>
-          <w:b/>
-          <w:color w:val="E47331"/>
-        </w:rPr>
-        <w:t xml:space="preserve">Anclaje (PDI y evidencia): </w:t>
-      </w:r>
-      <w:r>
-        <w:t>Ruta MAVI (branding, transformación digital). Encuesta: asesoría legal/tributaria 32 %, mentorías 29 %.</w:t>
       </w:r>
     </w:p>
     <w:p>
@@ -2322,6 +2322,21 @@
     </w:p>
     <w:p>
       <w:pPr>
+        <w:jc w:val="both"/>
+      </w:pPr>
+      <w:r>
+        <w:rPr>
+          <w:b/>
+          <w:color w:val="E47331"/>
+        </w:rPr>
+        <w:t xml:space="preserve">Justificación del diseño. </w:t>
+      </w:r>
+      <w:r>
+        <w:t>Esta fase cierra el ciclo conectando la iniciativa con el mercado, la financiación y la transferencia: deriva a convocatorias y capital semilla, protege la propiedad intelectual y promueve la creación de spin-offs, apoyándose en el ecosistema (Cientech como OTRI, Cámaras de Comercio y el Parque Tecnológico del Caribe). Su diseño responde a las metas explícitas del PDI —dos spin-offs, títulos de propiedad intelectual y la operación del Parque Tecnológico del Caribe (PTC)— y a la Estrategia 7 en su componente de «transferencia de conocimiento», así como a las Acciones 3 y 5 del Proyecto de Fortalecimiento (protección de la propiedad intelectual y canales de transferencia); se sustenta, además, en el benchmarking de Ruta N, Cientech y la Universidad de los Andes.</w:t>
+      </w:r>
+    </w:p>
+    <w:p>
+      <w:pPr>
         <w:pStyle w:val="Heading3"/>
       </w:pPr>
       <w:r>
@@ -2452,21 +2467,6 @@
       </w:r>
       <w:r>
         <w:t>Semana 14 en adelante / continuo.</w:t>
-      </w:r>
-    </w:p>
-    <w:p>
-      <w:pPr>
-        <w:jc w:val="both"/>
-      </w:pPr>
-      <w:r>
-        <w:rPr>
-          <w:b/>
-          <w:color w:val="E47331"/>
-        </w:rPr>
-        <w:t xml:space="preserve">Anclaje (PDI y evidencia): </w:t>
-      </w:r>
-      <w:r>
-        <w:t>PDI: 2 spin-off, PTC, transferencia tecnológica. Encuesta: acceso a convocatorias y financiación 32 %.</w:t>
       </w:r>
     </w:p>
     <w:p>

</xml_diff>

<commit_message>
Corrige anclaje PDI en fases 2 y 5: Linea Estrategica 3 y motor Articulacion con el sector productivo y la sociedad
</commit_message>
<xml_diff>
--- a/Ruta-Institucional-Emprendimiento-CIE.docx
+++ b/Ruta-Institucional-Emprendimiento-CIE.docx
@@ -1616,7 +1616,7 @@
         <w:t xml:space="preserve">Justificación del diseño. </w:t>
       </w:r>
       <w:r>
-        <w:t>Una vez despertado el interés, esta fase busca capturar las ideas antes de que se pierdan y ayudarlas a tomar forma, conectándose con los semilleros para nutrirse de proyectos de base científica. Su diseño se ancla en la Línea Estratégica 2.3 del PDI (fomentar el emprendimiento) y en la vinculación con la investigación propia del Motor Estratégico 2, y encuentra respaldo en los referentes maduros —como la Universidad de los Andes y la Corporación Universitaria Americana—, en los que la identificación de ideas aparece como el paso siguiente a la sensibilización.</w:t>
+        <w:t>Una vez despertado el interés, esta fase busca capturar las ideas antes de que se pierdan y ayudarlas a tomar forma, conectándose con los semilleros para nutrirse de proyectos de base científica. Su diseño se ancla en la Línea Estratégica 3 del PDI (Impacto regional, nacional e internacional desde la Extensión y Proyección Social) y, dentro de ella, en el motor de desarrollo «Articulación con el sector productivo y la sociedad», nutriéndose además de la investigación a través de los semilleros; encuentra respaldo en los referentes maduros —como la Universidad de los Andes y la Corporación Universitaria Americana—, en los que la identificación de ideas aparece como el paso siguiente a la sensibilización.</w:t>
       </w:r>
     </w:p>
     <w:p>
@@ -2146,7 +2146,7 @@
         <w:t xml:space="preserve">Justificación del diseño. </w:t>
       </w:r>
       <w:r>
-        <w:t>Cuando el proyecto ya está validado, necesita robustecerse para operar de manera sostenible; por ello esta fase ofrece mentorías especializadas, branding, transformación digital y asesoría legal y tributaria. Su diseño se ancla en la Línea Estratégica 2.3 del PDI (impacto productivo) y en la Acción 4 del Proyecto de Fortalecimiento (alianzas estratégicas para el acompañamiento), y se sustenta en la ruta de la Corporación MAVI —que incorpora branding y transformación digital— y en la demanda docente y estudiantil de mentorías y acompañamiento legal.</w:t>
+        <w:t>Cuando el proyecto ya está validado, necesita robustecerse para operar de manera sostenible; por ello esta fase ofrece mentorías especializadas, branding, transformación digital y asesoría legal y tributaria. Su diseño se ancla en la Línea Estratégica 3 del PDI y en su motor de desarrollo «Articulación con el sector productivo y la sociedad», así como en la Acción 4 del Proyecto de Fortalecimiento (alianzas estratégicas para el acompañamiento), y se sustenta en la ruta de la Corporación MAVI —que incorpora branding y transformación digital— y en la demanda docente y estudiantil de mentorías y acompañamiento legal.</w:t>
       </w:r>
     </w:p>
     <w:p>

</xml_diff>